<commit_message>
Rewrite paper in natural student voice
</commit_message>
<xml_diff>
--- a/FinalProject_Paper_Japan.docx
+++ b/FinalProject_Paper_Japan.docx
@@ -111,7 +111,7 @@
           <w:i w:val="0"/>
           <w:sz w:val="24"/>
         </w:rPr>
-        <w:t>Japan presents one of the most compelling macroeconomic case studies in the modern world. It is simultaneously an advanced, high-income economy with a GDP per capita of approximately $35,700 (IMF, 2026), one of the lowest unemployment rates globally at 2.5 percent, and a high Human Development Index score of 0.920 — and yet it faces a set of structural challenges that threaten its long-run trajectory. A shrinking population, the highest government debt-to-GDP ratio of any major advanced economy at roughly 255 percent, and slow GDP growth of just 0.6 percent in 2025 all demand careful policy attention. This report analyzes Japan's current macroeconomic position and provides both short-term and long-term policy recommendations from the perspective of IMF advisors.</w:t>
+        <w:t>For this final project, I chose Japan as my country because it is one of the most interesting economies to look at right now. Japan is a rich country with a strong history of economic success, but it is also dealing with some serious problems that do not have easy answers. Its real GDP per capita is around $35,700 according to the IMF, and unemployment is only 2.5 percent, which sounds great on the surface. But at the same time, its population is shrinking, its government debt is the highest of any major economy in the world, and growth has basically stalled out. As IMF advisors, the goal of this report is to explain where Japan stands economically and give some recommendations for what it should do going forward.</w:t>
       </w:r>
     </w:p>
     <w:p>
@@ -143,7 +143,7 @@
           <w:i w:val="0"/>
           <w:sz w:val="24"/>
         </w:rPr>
-        <w:t>Japan's real GDP per capita of $35,700 places it approximately 32nd globally, well above the world average of $15,680 but significantly below the United States at $94,430 (IMF, 2026). The gap reflects higher U.S. productivity, a larger and more flexible workforce, and a dominant services sector. Real GDP growth in Japan has decelerated sharply over recent decades; after the extraordinary Post-WWII Economic Miracle — during which GDP expanded at nearly 10 percent annually from 1945 to 1973 — growth has settled near zero to one percent in recent years. Japan's population is declining at approximately 0.5 percent per year due to low birth rates and minimal immigration, which directly constrains labor supply and long-run output potential.</w:t>
+        <w:t>Japan's real GDP per capita is around $35,700, which sounds like a lot, but when you compare it to the U.S. at $94,430, there is a pretty big gap (IMF, 2026). Part of the reason the U.S. is so much higher is because American workers tend to be more productive and the economy is much larger overall. Japan used to grow incredibly fast — in the decades after World War II, the country's economy grew at almost 10 percent per year, which economists call the 'Economic Miracle.' But since then, growth has slowed way down to basically 0 to 1 percent per year. A big part of the reason for this is that Japan's population is actually getting smaller, shrinking by about 0.5 percent per year because the birth rate is low and the country does not let many immigrants in. Fewer workers means less output, which makes it really hard to grow the economy.</w:t>
       </w:r>
     </w:p>
     <w:p>
@@ -159,7 +159,7 @@
           <w:i w:val="0"/>
           <w:sz w:val="24"/>
         </w:rPr>
-        <w:t>Japan's main export sector is automotive manufacturing, contributing over $100 billion annually and reflecting a strong comparative advantage in capital-intensive precision production. Companies such as Toyota, Honda, and Nissan dominate global markets. This export structure is sustained by Japan's deep stock of industrial capital and its culture of kaizen, or continuous process improvement, which produces quality and cost-control advantages difficult for other nations to replicate.</w:t>
+        <w:t>Japan's biggest export is cars. Companies like Toyota, Honda, and Nissan ship over $100 billion worth of vehicles every year to countries all over the world. Japan has a real advantage here because its workers are incredibly skilled at making high-quality products efficiently. This comes partly from a Japanese work philosophy called kaizen, which means always trying to improve. It is hard for other countries to compete with that level of precision and quality.</w:t>
       </w:r>
     </w:p>
     <w:p>
@@ -191,7 +191,7 @@
           <w:i w:val="0"/>
           <w:sz w:val="24"/>
         </w:rPr>
-        <w:t>From a production function perspective, Japan's capital stock per worker is already large, placing it on the flat portion of the diminishing-returns curve. Additional physical capital investment would yield only marginal output gains; meaningful growth must come from upward shifts of the production function — that is, improvements in technology and total factor productivity. Japan's institutional quality is favorable for this: the country scores approximately 0.73 out of 1.0 on the Liberal Political Institutions Index (Our World in Data, 2024), reflecting a stable democracy, independent judiciary, and secure property rights that support innovation and investment.</w:t>
+        <w:t>One of the concepts we covered in class is the production function, and Japan is a good example of what happens when a country already has a lot of capital. Because Japan has been building up factories, machines, and technology for decades, adding more capital does not help as much anymore because of diminishing returns. To actually grow, Japan needs to shift the whole production function upward by getting better technology and improving how productively workers use capital. The good news is that Japan has strong institutions that make this possible — it scores about 0.73 out of 1.0 on the Liberal Political Institutions Index (Our World in Data, 2024), which means it has a stable government, courts that work, and property rights that businesses can count on. That kind of environment encourages investment and innovation.</w:t>
       </w:r>
     </w:p>
     <w:p>
@@ -207,7 +207,7 @@
           <w:i w:val="0"/>
           <w:sz w:val="24"/>
         </w:rPr>
-        <w:t>Japan's human capital base is also strong. Its Human Development Index score of 0.920 ranks 24th globally (UNDP, 2023), driven by a life expectancy of approximately 84 years and an average of 13.4 years of schooling. This highly skilled workforce underpins Japan's strength in advanced manufacturing and technology. The challenge is demographic: as the workforce ages and shrinks, sustaining the human capital stock requires deliberate policy intervention.</w:t>
+        <w:t>Japan also has a really educated and healthy population. Its Human Development Index score is 0.920, which puts it at 24th in the world (UNDP, 2023). People in Japan live to about 84 years old on average, and the average person gets over 13 years of schooling. This is great for human capital. The problem is that this workforce is getting older and smaller every year because of the low birth rate. If Japan does not find a way to bring in more workers or make existing workers more productive, the economy will keep slowing down.</w:t>
       </w:r>
     </w:p>
     <w:p>
@@ -239,7 +239,7 @@
           <w:i w:val="0"/>
           <w:sz w:val="24"/>
         </w:rPr>
-        <w:t>Japan's unemployment rate of 2.5 percent is well below the United States' estimated natural rate of 4 percent. This reflects Japan's lifetime employment culture, which sharply reduces both frictional unemployment — workers cycling between jobs — and structural unemployment. With the labor market running tight and inflation at 2.7 percent, slightly above the Bank of Japan's 2 percent target, monetary tightening is appropriate. The Bank of Japan moved decisively: it ended its negative interest rate policy in March 2024, raised rates to 0.25 percent in July 2024, and again to 0.5 percent in January 2025 — its first sustained rate-hiking cycle in decades (Bank of Japan, 2025). This response is consistent with the Federal Reserve's dual mandate logic: raise rates when inflation is above target and unemployment is at or below the natural rate.</w:t>
+        <w:t>Japan has an unemployment rate of only 2.5 percent, which is lower than the U.S. natural rate of about 4 percent. One reason for this is that Japanese companies traditionally offer lifetime employment, so workers do not change jobs as often. This cuts down on frictional unemployment, which is the kind that happens when people are between jobs. But even though unemployment is very low, Japan has been dealing with inflation of about 2.7 percent, which is slightly above the Bank of Japan's 2 percent target. Because of this, the central bank started raising interest rates — from basically zero in early 2024, to 0.25 percent in July 2024, and then 0.5 percent in January 2025 (Bank of Japan, 2025). This is the right move because when inflation is above target and unemployment is already low, raising rates is the standard tool to cool the economy down a little. It is basically the same logic behind what the Federal Reserve does in the U.S.</w:t>
       </w:r>
     </w:p>
     <w:p>
@@ -271,7 +271,7 @@
           <w:i w:val="0"/>
           <w:sz w:val="24"/>
         </w:rPr>
-        <w:t>Japan's government expenditure represents approximately 38 to 40 percent of GDP, and the country runs budget deficits of roughly 5 to 6 percent annually (IMF, 2024). With the output gap near zero — the economy is operating close to its potential — counter-cyclical best practice calls for fiscal consolidation. Japan is not following this practice, partly because demographic pressures create unavoidable structural spending on pensions and healthcare. The resulting debt-to-GDP ratio of approximately 255 percent is the highest among major advanced economies. While roughly 90 percent of this debt is held domestically, limiting the risk of a foreign-driven crisis, the long-term trajectory is unsustainable without reform. A shrinking tax base and rising social security costs create a structural imbalance that will worsen without intervention.</w:t>
+        <w:t>Japan's government spends a lot — about 38 to 40 percent of GDP — and still runs a deficit of around 5 to 6 percent every year (IMF, 2024). Because the economy is already running close to its potential output, this kind of deficit spending is not really needed and just adds to the debt. Japan's debt-to-GDP ratio is now around 255 percent, which is the highest of any major country in the world. That number sounds alarming, but the situation is a little less scary than it looks because about 90 percent of the debt is owned by Japanese citizens and institutions, not foreign lenders. Still, the problem is getting worse every year. As the population gets older, the government has to spend more on pensions and healthcare, but fewer people are working and paying taxes. Without some kind of reform, this is going to become a really serious problem.</w:t>
       </w:r>
     </w:p>
     <w:p>
@@ -303,7 +303,7 @@
           <w:i w:val="0"/>
           <w:sz w:val="24"/>
         </w:rPr>
-        <w:t>In the short term, the Bank of Japan should continue its gradual rate-normalization path to bring inflation back to the 2 percent target while monitoring employment closely. Simultaneously, the government should pursue modest fiscal consolidation — reducing discretionary spending and allowing automatic stabilizers to function — to begin stabilizing the debt-to-GDP ratio before it deteriorates further.</w:t>
+        <w:t>In the short term, Japan should keep raising interest rates slowly to get inflation back down to the 2 percent target. The Bank of Japan needs to be careful not to raise rates too fast though, because that could hurt growth. The government should also try to spend a little less money where it can so the deficit does not keep growing. Even small steps toward balancing the budget would help stop the debt from getting even worse.</w:t>
       </w:r>
     </w:p>
     <w:p>
@@ -319,7 +319,7 @@
           <w:i w:val="0"/>
           <w:sz w:val="24"/>
         </w:rPr>
-        <w:t>In the long term, Japan's most urgent priority is addressing demographic decline. Expanding immigration pathways for skilled workers would directly grow the labor supply and broaden the tax base. Structural labor market reforms — increasing flexibility, reducing the cultural dependence on lifetime employment, and expanding female workforce participation — would also raise potential output. To sustain growth on the production function's flat portion, Japan must invest heavily in R&amp;D, artificial intelligence, and automation to shift the production function upward through technology. Finally, pension and healthcare reform is essential to reduce the structural deficit and place the debt-to-GDP ratio on a downward path. Together, these measures would position Japan to maintain its status as a high-income, stable economy over the next generation.</w:t>
+        <w:t>In the long run, the biggest thing Japan needs to fix is its population problem. The easiest way to do that would be to let more skilled immigrants into the country, which would add workers and taxpayers at the same time. Japan should also make its labor market more flexible — the lifetime employment system works in some ways, but it also makes it hard for companies to adapt and for workers to move into higher-productivity jobs. Getting more women into the workforce full-time would also help a lot. On top of that, Japan needs to keep investing in technology like AI and automation so that each worker can produce more output. This is the only real way to keep growing when you have fewer people. Finally, Japan has to reform its pension and healthcare systems to reduce long-term spending. None of these things are easy, but without them, Japan is going to keep falling further behind other advanced economies.</w:t>
       </w:r>
     </w:p>
     <w:p>

</xml_diff>